<commit_message>
Update user guide to v3.0: WA Tagih, Janji Bayar, offline sync, Excel export, KPI scoring, 4th upload slot
</commit_message>
<xml_diff>
--- a/Panduan_Aplikasi_Penagihan_Tim.docx
+++ b/Panduan_Aplikasi_Penagihan_Tim.docx
@@ -28,7 +28,7 @@
         </w:rPr>
         <w:t>PT PELINDO DAYA SEJAHTERA</w:t>
         <w:br/>
-        <w:t>Versi 2.0 - Eksekutif &amp; Tim</w:t>
+        <w:t>Versi 3.0 - Eksekutif &amp; Tim</w:t>
       </w:r>
     </w:p>
     <w:p>
@@ -151,7 +151,7 @@
     </w:p>
     <w:p>
       <w:r>
-        <w:t>Khusus 1 orang Admin pusat ditugaskan untuk memperbarui master data harian. Berikut 3 tahapan file yang diunggah ke aplikasi:</w:t>
+        <w:t>Khusus 1 orang Admin pusat ditugaskan untuk memperbarui master data harian. Berikut 4 tahapan file yang bisa diunggah ke aplikasi (nomor 1 wajib, sisanya opsional):</w:t>
       </w:r>
     </w:p>
     <w:tbl>
@@ -302,11 +302,54 @@
           </w:p>
         </w:tc>
       </w:tr>
+      <w:tr>
+        <w:tc>
+          <w:tcPr>
+            <w:tcW w:type="dxa" w:w="2880"/>
+          </w:tcPr>
+          <w:p>
+            <w:r>
+              <w:t>4. Histori Masalah TANOS</w:t>
+            </w:r>
+          </w:p>
+        </w:tc>
+        <w:tc>
+          <w:tcPr>
+            <w:tcW w:type="dxa" w:w="2880"/>
+          </w:tcPr>
+          <w:p>
+            <w:r>
+              <w:t>Opsional</w:t>
+            </w:r>
+          </w:p>
+        </w:tc>
+        <w:tc>
+          <w:tcPr>
+            <w:tcW w:type="dxa" w:w="2880"/>
+          </w:tcPr>
+          <w:p>
+            <w:r>
+              <w:t>Melengkapi histori status/masalah invoice (mis. histori BA Reject) agar konteks follow-up lebih lengkap di kartu invoice.</w:t>
+            </w:r>
+          </w:p>
+        </w:tc>
+      </w:tr>
     </w:tbl>
     <w:p>
       <w:r>
         <w:br/>
         <w:t>Setelah di-upload, Admin harus menekan "Klik Proses &amp; Muat Data" lalu menekan tombol "Push ke Cloud / Google Sheets" secara berurutan.</w:t>
+      </w:r>
+    </w:p>
+    <w:p>
+      <w:pPr>
+        <w:ind w:left="720"/>
+      </w:pPr>
+      <w:r>
+        <w:rPr>
+          <w:i/>
+        </w:rPr>
+        <w:t>Catatan: Admin dapat mengatur "PIN Admin Lokal" (opsional) untuk mengunci proses olah master data di perangkat tersebut. PIN ini tersimpan lokal di browser masing-masing perangkat, bukan di source code aplikasi.</w:t>
       </w:r>
     </w:p>
     <w:p>
@@ -362,13 +405,112 @@
     </w:p>
     <w:p>
       <w:pPr>
+        <w:spacing w:before="200"/>
+      </w:pPr>
+      <w:r>
+        <w:rPr>
+          <w:b/>
+        </w:rPr>
+        <w:t>Fitur Tambahan di Tab Antrian:</w:t>
+      </w:r>
+    </w:p>
+    <w:p>
+      <w:pPr>
+        <w:pStyle w:val="ListBullet2"/>
+      </w:pPr>
+      <w:r>
+        <w:rPr>
+          <w:b/>
+        </w:rPr>
+        <w:t xml:space="preserve">💬 WA Tagih — </w:t>
+      </w:r>
+      <w:r>
+        <w:t>Tombol di tiap kartu invoice (dan di dalam Modal) untuk langsung membuka WhatsApp dengan draft pesan otomatis ke customer, sudah disesuaikan dengan kendala/bottleneck invoice tersebut (Nota Dinas, MIR7, BA/BAST, Surat Tagihan, atau menunggu pembayaran).</w:t>
+      </w:r>
+    </w:p>
+    <w:p>
+      <w:pPr>
+        <w:pStyle w:val="ListBullet2"/>
+      </w:pPr>
+      <w:r>
+        <w:rPr>
+          <w:b/>
+        </w:rPr>
+        <w:t xml:space="preserve">📅 Widget &amp; Filter Janji Bayar — </w:t>
+      </w:r>
+      <w:r>
+        <w:t>Menampilkan pengingat invoice dengan janji bayar yang jatuh tempo hari ini maupun yang sudah lewat tempo, supaya tidak terlewat follow-up-nya.</w:t>
+      </w:r>
+    </w:p>
+    <w:p>
+      <w:pPr>
+        <w:pStyle w:val="ListBullet2"/>
+      </w:pPr>
+      <w:r>
+        <w:rPr>
+          <w:b/>
+        </w:rPr>
+        <w:t xml:space="preserve">⏱️ Badge Durasi &amp; Filter Stagnan SLA 2x24 Jam — </w:t>
+      </w:r>
+      <w:r>
+        <w:t>Setiap kartu invoice menampilkan berapa hari sejak aktivitas/log terakhir dicatat. Invoice yang lebih dari 2 hari tanpa aktivitas akan ditandai ⚠️ dan bisa difilter lewat tombol filter "Stagnan" di tab Antrian.</w:t>
+      </w:r>
+    </w:p>
+    <w:p>
+      <w:pPr>
+        <w:pStyle w:val="Heading1"/>
+      </w:pPr>
+      <w:r>
+        <w:rPr>
+          <w:color w:val="003399"/>
+        </w:rPr>
+        <w:t>5. AUTO-SYNC &amp; MODE OFFLINE</w:t>
+      </w:r>
+    </w:p>
+    <w:p>
+      <w:pPr>
+        <w:pStyle w:val="ListBullet2"/>
+      </w:pPr>
+      <w:r>
+        <w:t>Selama tab aplikasi terbuka, data (invoice, aging, log FU) otomatis disinkronkan ulang dari Google Sheets setiap 60 detik, tanpa perlu klik manual.</w:t>
+      </w:r>
+    </w:p>
+    <w:p>
+      <w:pPr>
+        <w:pStyle w:val="ListBullet2"/>
+      </w:pPr>
+      <w:r>
+        <w:t>Kalau koneksi internet terputus saat menyimpan log follow-up, sistem akan menyimpan draft log tersebut secara lokal di perangkat (antrian tertunda) dan otomatis mengirimkannya ke Sheets begitu koneksi kembali normal — data tidak akan hilang.</w:t>
+      </w:r>
+    </w:p>
+    <w:p>
+      <w:pPr>
+        <w:pStyle w:val="Heading1"/>
+      </w:pPr>
+      <w:r>
+        <w:rPr>
+          <w:color w:val="003399"/>
+        </w:rPr>
+        <w:t>6. EXPORT LAPORAN EKSEKUTIF (EXCEL)</w:t>
+      </w:r>
+    </w:p>
+    <w:p>
+      <w:pPr>
+        <w:pStyle w:val="ListBullet2"/>
+      </w:pPr>
+      <w:r>
+        <w:t>Supervisor/manajemen dapat mengunduh laporan penagihan dalam format Excel multi-sheet (ringkasan, pipeline, invoice unpaid, dsb.) langsung dari aplikasi, tanpa perlu menyusun manual.</w:t>
+      </w:r>
+    </w:p>
+    <w:p>
+      <w:pPr>
         <w:pStyle w:val="Heading1"/>
       </w:pPr>
       <w:r>
         <w:rPr>
           <w:color w:val="CC0000"/>
         </w:rPr>
-        <w:t>5. PANDUAN DASHBOARD EKSKUTIF &amp; KPI (MANAGEMENT VIEW)</w:t>
+        <w:t>7. PANDUAN DASHBOARD EKSKUTIF &amp; KPI (MANAGEMENT VIEW)</w:t>
       </w:r>
     </w:p>
     <w:p>
@@ -438,6 +580,67 @@
       </w:pPr>
       <w:r>
         <w:t>Menampilkan nasabah spesifik dengan jumlah tagihan tidak terbayar terlama secara realtime.</w:t>
+      </w:r>
+    </w:p>
+    <w:p>
+      <w:pPr>
+        <w:pStyle w:val="ListBullet"/>
+      </w:pPr>
+      <w:r>
+        <w:t>SKOR KPI PER PIC</w:t>
+      </w:r>
+    </w:p>
+    <w:p>
+      <w:pPr>
+        <w:ind w:left="720"/>
+      </w:pPr>
+      <w:r>
+        <w:t>Setiap PIC memiliki skor KPI 0-100 berdasarkan bobot kriteria kerja masing-masing tim:</w:t>
+      </w:r>
+    </w:p>
+    <w:p>
+      <w:pPr>
+        <w:pStyle w:val="ListBullet2"/>
+      </w:pPr>
+      <w:r>
+        <w:rPr>
+          <w:b/>
+        </w:rPr>
+        <w:t xml:space="preserve">Tim Follow Up: </w:t>
+      </w:r>
+      <w:r>
+        <w:t>Collection Result (22%), Follow Up Discipline (24%), Overdue Reduction (20%), Pipeline Movement (22%), Data Quality (12%).</w:t>
+      </w:r>
+    </w:p>
+    <w:p>
+      <w:pPr>
+        <w:pStyle w:val="ListBullet2"/>
+      </w:pPr>
+      <w:r>
+        <w:rPr>
+          <w:b/>
+        </w:rPr>
+        <w:t xml:space="preserve">Tim Surat: </w:t>
+      </w:r>
+      <w:r>
+        <w:t>SLA Speed (30%), Backlog Control (25%), Output Productivity (20%), Document Accuracy (15%), Update Discipline (10%).</w:t>
+      </w:r>
+    </w:p>
+    <w:p>
+      <w:pPr>
+        <w:ind w:left="720"/>
+      </w:pPr>
+      <w:r>
+        <w:t xml:space="preserve">Skor akhir dikelompokkan ke dalam band: </w:t>
+      </w:r>
+      <w:r>
+        <w:rPr>
+          <w:b/>
+        </w:rPr>
+        <w:t>Excellent (≥82), Good (≥70), Watchlist (≥58), Needs Focus (&lt;58)</w:t>
+      </w:r>
+      <w:r>
+        <w:t>. Rincian formula dan pembobotan tiap kriteria bisa dilihat langsung di tab Dashboard.</w:t>
       </w:r>
     </w:p>
     <w:p>

</xml_diff>

<commit_message>
Fix guide: document official quarterly KPI Resmi (Rizal & Achmad) instead of generic criteria score
</commit_message>
<xml_diff>
--- a/Panduan_Aplikasi_Penagihan_Tim.docx
+++ b/Panduan_Aplikasi_Penagihan_Tim.docx
@@ -587,7 +587,7 @@
         <w:pStyle w:val="ListBullet"/>
       </w:pPr>
       <w:r>
-        <w:t>SKOR KPI PER PIC</w:t>
+        <w:t>KPI RESMI (RIZAL &amp; ACHMAD)</w:t>
       </w:r>
     </w:p>
     <w:p>
@@ -595,7 +595,79 @@
         <w:ind w:left="720"/>
       </w:pPr>
       <w:r>
-        <w:t>Setiap PIC memiliki skor KPI 0-100 berdasarkan bobot kriteria kerja masing-masing tim:</w:t>
+        <w:t>Skor KPI utama di Dashboard mengacu langsung ke Formulir Monitoring KPI Triwulan resmi yang ditandatangani leadership (per jabatan, per kuartal). Kuartal bisa dipilih lewat dropdown "Kuartal" di tab Dashboard (mis. TW III 2026). Item &amp; bobotnya beda per jabatan:</w:t>
+      </w:r>
+    </w:p>
+    <w:p>
+      <w:pPr>
+        <w:pStyle w:val="ListBullet2"/>
+      </w:pPr>
+      <w:r>
+        <w:rPr>
+          <w:b/>
+        </w:rPr>
+        <w:t xml:space="preserve">Staff Penagihan (Rizal): </w:t>
+      </w:r>
+      <w:r>
+        <w:t>A1 Penerbitan nota tagihan, A2 Follow up tagihan periode berjalan, A3 Pemenuhan/pembetulan tagihan reject, A4 Penerimaan kas MIR7 — masing-masing bobot 25%.</w:t>
+      </w:r>
+    </w:p>
+    <w:p>
+      <w:pPr>
+        <w:pStyle w:val="ListBullet2"/>
+      </w:pPr>
+      <w:r>
+        <w:rPr>
+          <w:b/>
+        </w:rPr>
+        <w:t xml:space="preserve">Staf Keuangan (Achmad): </w:t>
+      </w:r>
+      <w:r>
+        <w:t>item A1-A4 sama seperti di atas (bobot 25%/25%/20%/25%), ditambah A5 Implementasi ICOFR (5%, dinilai tahunan).</w:t>
+      </w:r>
+    </w:p>
+    <w:p>
+      <w:pPr>
+        <w:pStyle w:val="ListBullet2"/>
+      </w:pPr>
+      <w:r>
+        <w:rPr>
+          <w:b/>
+        </w:rPr>
+        <w:t xml:space="preserve">Sumber AUTO (SNAPSHOT): </w:t>
+      </w:r>
+      <w:r>
+        <w:t>item A1-A4 dihitung otomatis dari persentase invoice bermasalah yang sudah selesai/resolve sejak baseline kuartal berjalan. Admin wajib klik tombol "Set Baseline" di awal tiap kuartal — kalau belum di-set, item akan tampil "Belum ada baseline".</w:t>
+      </w:r>
+    </w:p>
+    <w:p>
+      <w:pPr>
+        <w:pStyle w:val="ListBullet2"/>
+      </w:pPr>
+      <w:r>
+        <w:rPr>
+          <w:b/>
+        </w:rPr>
+        <w:t xml:space="preserve">Sumber MANUAL: </w:t>
+      </w:r>
+      <w:r>
+        <w:t>item seperti A5 (ICOFR) tidak punya sumber data otomatis di dashboard ini (mis. pranota, uang muka) sehingga nilainya diisi manual oleh admin.</w:t>
+      </w:r>
+    </w:p>
+    <w:p>
+      <w:pPr>
+        <w:pStyle w:val="ListBullet"/>
+      </w:pPr>
+      <w:r>
+        <w:t>SKOR KPI PIC LAINNYA</w:t>
+      </w:r>
+    </w:p>
+    <w:p>
+      <w:pPr>
+        <w:ind w:left="720"/>
+      </w:pPr>
+      <w:r>
+        <w:t>Anggota tim lain yang belum punya Formulir KPI Triwulan resmi ditampilkan dengan skor berbasis kriteria kerja standar sebagai referensi sementara, sampai formulir resmi mereka tersedia:</w:t>
       </w:r>
     </w:p>
     <w:p>
@@ -631,13 +703,13 @@
         <w:ind w:left="720"/>
       </w:pPr>
       <w:r>
-        <w:t xml:space="preserve">Skor akhir dikelompokkan ke dalam band: </w:t>
+        <w:t xml:space="preserve">Band skor berlaku untuk kedua sistem di atas: </w:t>
       </w:r>
       <w:r>
         <w:rPr>
           <w:b/>
         </w:rPr>
-        <w:t>Excellent (≥82), Good (≥70), Watchlist (≥58), Needs Focus (&lt;58)</w:t>
+        <w:t>Excellent (≥82), Good (70-81.99), Watch (58-69.99), Critical (&lt;58)</w:t>
       </w:r>
       <w:r>
         <w:t>. Rincian formula dan pembobotan tiap kriteria bisa dilihat langsung di tab Dashboard.</w:t>

</xml_diff>